<commit_message>
chore(bench): regenerate mock briefings with v1.3.0 prompts
Regenerates every artefact under benchmarks/outputs/mock/ via
`bun run bench:mock` so the 11 mock briefings reflect the
decision-first openings introduced by the updated synthesis
fixtures.

Every briefing directory refreshes brief.md, brief.pdf,
brief.docx, and metadata.json. Under the hood the mock LLM
provider is deterministic (fixture-driven), so this is a pure
consequence of the fixture rewrites plus the new
FRAMING CLARITY CHECK block in the Synthesis prompt.

No API cost; no live briefing regenerated in this release.
Empirical re-scoring of the mocks against the v1.3.0 prompts
is deferred to v1.3.1 — see docs/v1.3.1-runbook.md.

Co-Authored-By: Claude Opus 4.7 (1M context) <noreply@anthropic.com>
</commit_message>
<xml_diff>
--- a/benchmarks/outputs/mock/01-german-market-entry/brief.docx
+++ b/benchmarks/outputs/mock/01-german-market-entry/brief.docx
@@ -15,7 +15,7 @@
         <w:pStyle w:val="Small"/>
       </w:pPr>
       <w:r>
-        <w:t xml:space="preserve">Format: mckinsey-style-note · Provider: mock · Generated: 2026-08-19T12:23:41.550Z</w:t>
+        <w:t xml:space="preserve">Format: mckinsey-style-note · Provider: mock · Generated: 2026-08-20T07:44:24.855Z</w:t>
       </w:r>
     </w:p>
     <w:p>
@@ -23,7 +23,7 @@
         <w:pStyle w:val="Small"/>
       </w:pPr>
       <w:r>
-        <w:t xml:space="preserve">Recommended: OPT-A · Aggregated risk: high · Total words: 326 / 1200</w:t>
+        <w:t xml:space="preserve">Recommended: OPT-A · Aggregated risk: high · Total words: 372 / 1200</w:t>
       </w:r>
     </w:p>
     <w:p>
@@ -99,7 +99,7 @@
     </w:p>
     <w:p>
       <w:r>
-        <w:t xml:space="preserve">The German mid-market SaaS segment grew 12% CAGR between 2022 and 2025 and now represents the largest addressable slice of EMEA. Foreign providers captured roughly 22% of the €7.5bn 2022-2025 growth, with the remainder held by domestic players.</w:t>
+        <w:t xml:space="preserve">Enter Germany via a majority partnership by Q3 2026, or lose the mid-market SaaS entry window for the next 18 months. The German mid-market SaaS segment grew 12% CAGR between 2022 and 2025 and now represents the largest addressable slice of EMEA. Foreign providers captured roughly 22 percent of the 7.5 billion euro 2022-2025 growth, with the remainder held by domestic players — a foothold that regulatory tightening and SAP's DACH mid-market defence are set to close over the next 18 months.</w:t>
       </w:r>
     </w:p>
     <w:p>

</xml_diff>